<commit_message>
Dodato user-friendly prikazivanje tabele iteracija
</commit_message>
<xml_diff>
--- a/ElGamal Kripto-sistem — Frontend dokumentacija.docx
+++ b/ElGamal Kripto-sistem — Frontend dokumentacija.docx
@@ -782,6 +782,28 @@
     <w:p>
       <w:pPr>
         <w:spacing w:after="240" w:before="240" w:lineRule="auto"/>
+        <w:ind w:left="0" w:firstLine="0"/>
+        <w:rPr>
+          <w:b w:val="1"/>
+          <w:bCs w:val="1"/>
+          <w:sz w:val="21"/>
+          <w:szCs w:val="21"/>
+        </w:rPr>
+      </w:pPr>
+      <w:r>
+        <w:rPr>
+          <w:b w:val="1"/>
+          <w:bCs w:val="1"/>
+          <w:sz w:val="21"/>
+          <w:szCs w:val="21"/>
+          <w:rtl w:val="0"/>
+        </w:rPr>
+        <w:t xml:space="preserve">Tabela blokova inicijalno učitava 5 iteracija. Ukoliko postoji više iteracija, ispod tabele se učitavaju dugme za učitavanje sledećih 20 iteracija i dugme za učitavanje svih iteracija odjednom. Ako su učitane sve iteracije, pojavljuje se i dugme koje korisnika šalje na dno radi lakšeg pokretanja dekripcije.</w:t>
+      </w:r>
+    </w:p>
+    <w:p>
+      <w:pPr>
+        <w:spacing w:after="240" w:before="240" w:lineRule="auto"/>
         <w:rPr>
           <w:b w:val="1"/>
           <w:bCs w:val="1"/>
@@ -1913,8 +1935,13 @@
       </w:pPr>
       <w:r>
         <w:rPr>
-          <w:rtl w:val="0"/>
-        </w:rPr>
+          <w:b w:val="1"/>
+          <w:bCs w:val="1"/>
+          <w:sz w:val="21"/>
+          <w:szCs w:val="21"/>
+          <w:rtl w:val="0"/>
+        </w:rPr>
+        <w:t xml:space="preserve">https://github.com/Filip03/ElGamal---kriptografija.git</w:t>
       </w:r>
     </w:p>
     <w:sectPr>

</xml_diff>